<commit_message>
feat: unify Midnight Vault UI with archetype engine; refresh submissions for all 7 members
</commit_message>
<xml_diff>
--- a/submissions/CapExIQ_Individual_Report.docx
+++ b/submissions/CapExIQ_Individual_Report.docx
@@ -319,7 +319,7 @@
                 <w:sz w:val="17"/>
                 <w:szCs w:val="17"/>
               </w:rPr>
-              <w:t xml:space="preserve">Student</w:t>
+              <w:t xml:space="preserve">Group members</w:t>
             </w:r>
           </w:p>
         </w:tc>
@@ -346,7 +346,7 @@
                 <w:sz w:val="17"/>
                 <w:szCs w:val="17"/>
               </w:rPr>
-              <w:t xml:space="preserve">[Student Name]</w:t>
+              <w:t xml:space="preserve">Krishna Mathur · Neel Kapadia · Yash Petkar · Atharva Soundankar · Tanishk Verma · Nihal Pusthe · Karan Baid</w:t>
             </w:r>
           </w:p>
         </w:tc>
@@ -522,7 +522,7 @@
                 <w:sz w:val="17"/>
                 <w:szCs w:val="17"/>
               </w:rPr>
-              <w:t xml:space="preserve">1,445 words (excluding tables, headings and front matter)</w:t>
+              <w:t xml:space="preserve">1,645 words (excluding tables, headings and front matter)</w:t>
             </w:r>
           </w:p>
         </w:tc>
@@ -597,7 +597,7 @@
           <w:sz w:val="21"/>
           <w:szCs w:val="21"/>
         </w:rPr>
-        <w:t xml:space="preserve">CapExIQ is not a single-purpose calculator. It ships eight investment archetypes covering the full range of capital decisions in the brief, and ten AI capabilities, each of which degrades to a deterministic fallback when no model is available.</w:t>
+        <w:t xml:space="preserve">CapExIQ is not a single-purpose calculator. It ships eight investment archetypes spanning the capital decisions named in the brief, and twelve AI capabilities, each degrading to a deterministic fallback when no model is available.</w:t>
       </w:r>
     </w:p>
     <w:tbl>
@@ -4668,7 +4668,7 @@
           <w:sz w:val="21"/>
           <w:szCs w:val="21"/>
         </w:rPr>
-        <w:t xml:space="preserve">AI improves the work in four ways: it compresses the drafting cycle from hours to seconds, it interrogates assumptions from perspectives an author would not volunteer, it makes the model addressable in natural language by directors who will not open a spreadsheet, and it structures unstructured inputs such as vendor quotations. It does not improve the arithmetic, and is deliberately prevented from touching it. Ten capabilities are implemented; each degrades to a deterministic fallback, so the platform is fully functional with no API key.</w:t>
+        <w:t xml:space="preserve">AI improves the work in four ways: it compresses drafting from hours to seconds, it interrogates assumptions from perspectives an author would not volunteer, it makes the model addressable in natural language by directors who will not open a spreadsheet, and it structures unstructured inputs such as vendor quotations. It does not improve the arithmetic and is deliberately prevented from touching it. Twelve capabilities are implemented; each degrades to a deterministic fallback, so the platform is fully functional with no API key.</w:t>
       </w:r>
     </w:p>
     <w:tbl>
@@ -6381,7 +6381,7 @@
                 <w:sz w:val="14"/>
                 <w:szCs w:val="14"/>
               </w:rPr>
-              <w:t xml:space="preserve">Macro briefing</w:t>
+              <w:t xml:space="preserve">Retrieval-grounded answers</w:t>
             </w:r>
           </w:p>
         </w:tc>
@@ -6408,7 +6408,7 @@
                 <w:sz w:val="14"/>
                 <w:szCs w:val="14"/>
               </w:rPr>
-              <w:t xml:space="preserve">Summarises the macro drivers that matter for this investment type</w:t>
+              <w:t xml:space="preserve">Retrieves the passages of project documentation that bear on a question before answering</w:t>
             </w:r>
           </w:p>
         </w:tc>
@@ -6435,7 +6435,7 @@
                 <w:sz w:val="14"/>
                 <w:szCs w:val="14"/>
               </w:rPr>
-              <w:t xml:space="preserve">Rates, FX, tariff and inflation data passed in the request</w:t>
+              <w:t xml:space="preserve">A 112-passage corpus built from the methodology, assumption register and scenario definitions</w:t>
             </w:r>
           </w:p>
         </w:tc>
@@ -6462,7 +6462,7 @@
                 <w:sz w:val="14"/>
                 <w:szCs w:val="14"/>
               </w:rPr>
-              <w:t xml:space="preserve">Driver-by-driver briefing with gaps named</w:t>
+              <w:t xml:space="preserve">A streamed answer in which every claim carries a numbered citation to its source extract</w:t>
             </w:r>
           </w:p>
         </w:tc>
@@ -6489,7 +6489,7 @@
                 <w:sz w:val="14"/>
                 <w:szCs w:val="14"/>
               </w:rPr>
-              <w:t xml:space="preserve">Frames external conditions around the specific decision</w:t>
+              <w:t xml:space="preserve">A reader can verify each statement against the document it came from rather than trusting it</w:t>
             </w:r>
           </w:p>
         </w:tc>
@@ -6516,7 +6516,7 @@
                 <w:sz w:val="14"/>
                 <w:szCs w:val="14"/>
               </w:rPr>
-              <w:t xml:space="preserve">No live market access — it reasons only over supplied data</w:t>
+              <w:t xml:space="preserve">Retrieval can miss a relevant passage; a citation proves provenance, not correctness</w:t>
             </w:r>
           </w:p>
         </w:tc>
@@ -6548,7 +6548,7 @@
                 <w:sz w:val="14"/>
                 <w:szCs w:val="14"/>
               </w:rPr>
-              <w:t xml:space="preserve">Voice intent</w:t>
+              <w:t xml:space="preserve">Macro reference panel</w:t>
             </w:r>
           </w:p>
         </w:tc>
@@ -6574,7 +6574,7 @@
                 <w:sz w:val="14"/>
                 <w:szCs w:val="14"/>
               </w:rPr>
-              <w:t xml:space="preserve">Maps a spoken command to a structured application action</w:t>
+              <w:t xml:space="preserve">Presents the external rate, tariff and tax basis behind the model</w:t>
             </w:r>
           </w:p>
         </w:tc>
@@ -6600,7 +6600,7 @@
                 <w:sz w:val="14"/>
                 <w:szCs w:val="14"/>
               </w:rPr>
-              <w:t xml:space="preserve">Transcribed text plus workspace context</w:t>
+              <w:t xml:space="preserve">Values transcribed by hand from published sources, each carrying its citation and as-of date</w:t>
             </w:r>
           </w:p>
         </w:tc>
@@ -6626,7 +6626,7 @@
                 <w:sz w:val="14"/>
                 <w:szCs w:val="14"/>
               </w:rPr>
-              <w:t xml:space="preserve">Typed intent with parameters, or an explicit unknown</w:t>
+              <w:t xml:space="preserve">A reference panel explicitly flagged as not live</w:t>
             </w:r>
           </w:p>
         </w:tc>
@@ -6652,6 +6652,173 @@
                 <w:sz w:val="14"/>
                 <w:szCs w:val="14"/>
               </w:rPr>
+              <w:t xml:space="preserve">External inputs are auditable to a named public document</w:t>
+            </w:r>
+          </w:p>
+        </w:tc>
+        <w:tc>
+          <w:tcPr>
+            <w:tcW w:type="dxa" w:w="1520"/>
+            <w:tcMar>
+              <w:top w:type="dxa" w:w="60"/>
+              <w:left w:type="dxa" w:w="90"/>
+              <w:bottom w:type="dxa" w:w="60"/>
+              <w:right w:type="dxa" w:w="90"/>
+            </w:tcMar>
+          </w:tcPr>
+          <w:p>
+            <w:pPr>
+              <w:spacing w:after="0" w:before="0" w:line="250"/>
+              <w:jc w:val="left"/>
+            </w:pPr>
+            <w:r>
+              <w:rPr>
+                <w:rFonts w:ascii="Calibri" w:cs="Calibri" w:eastAsia="Calibri" w:hAnsi="Calibri"/>
+                <w:color w:val="1F2937"/>
+                <w:sz w:val="14"/>
+                <w:szCs w:val="14"/>
+              </w:rPr>
+              <w:t xml:space="preserve">Values are point-in-time and must be re-transcribed as sources are revised</w:t>
+            </w:r>
+          </w:p>
+        </w:tc>
+      </w:tr>
+      <w:tr>
+        <w:trPr>
+          <w:cantSplit/>
+          <w:tblHeader w:val="false"/>
+        </w:trPr>
+        <w:tc>
+          <w:tcPr>
+            <w:tcW w:type="dxa" w:w="1420"/>
+            <w:shd w:fill="EEF3F8" w:color="auto" w:val="clear"/>
+            <w:tcMar>
+              <w:top w:type="dxa" w:w="60"/>
+              <w:left w:type="dxa" w:w="90"/>
+              <w:bottom w:type="dxa" w:w="60"/>
+              <w:right w:type="dxa" w:w="90"/>
+            </w:tcMar>
+          </w:tcPr>
+          <w:p>
+            <w:pPr>
+              <w:spacing w:after="0" w:before="0" w:line="250"/>
+              <w:jc w:val="left"/>
+            </w:pPr>
+            <w:r>
+              <w:rPr>
+                <w:rFonts w:ascii="Calibri" w:cs="Calibri" w:eastAsia="Calibri" w:hAnsi="Calibri"/>
+                <w:color w:val="1F2937"/>
+                <w:sz w:val="14"/>
+                <w:szCs w:val="14"/>
+              </w:rPr>
+              <w:t xml:space="preserve">Voice intent</w:t>
+            </w:r>
+          </w:p>
+        </w:tc>
+        <w:tc>
+          <w:tcPr>
+            <w:tcW w:type="dxa" w:w="1720"/>
+            <w:shd w:fill="EEF3F8" w:color="auto" w:val="clear"/>
+            <w:tcMar>
+              <w:top w:type="dxa" w:w="60"/>
+              <w:left w:type="dxa" w:w="90"/>
+              <w:bottom w:type="dxa" w:w="60"/>
+              <w:right w:type="dxa" w:w="90"/>
+            </w:tcMar>
+          </w:tcPr>
+          <w:p>
+            <w:pPr>
+              <w:spacing w:after="0" w:before="0" w:line="250"/>
+              <w:jc w:val="left"/>
+            </w:pPr>
+            <w:r>
+              <w:rPr>
+                <w:rFonts w:ascii="Calibri" w:cs="Calibri" w:eastAsia="Calibri" w:hAnsi="Calibri"/>
+                <w:color w:val="1F2937"/>
+                <w:sz w:val="14"/>
+                <w:szCs w:val="14"/>
+              </w:rPr>
+              <w:t xml:space="preserve">Maps a spoken command to a structured application action</w:t>
+            </w:r>
+          </w:p>
+        </w:tc>
+        <w:tc>
+          <w:tcPr>
+            <w:tcW w:type="dxa" w:w="1580"/>
+            <w:shd w:fill="EEF3F8" w:color="auto" w:val="clear"/>
+            <w:tcMar>
+              <w:top w:type="dxa" w:w="60"/>
+              <w:left w:type="dxa" w:w="90"/>
+              <w:bottom w:type="dxa" w:w="60"/>
+              <w:right w:type="dxa" w:w="90"/>
+            </w:tcMar>
+          </w:tcPr>
+          <w:p>
+            <w:pPr>
+              <w:spacing w:after="0" w:before="0" w:line="250"/>
+              <w:jc w:val="left"/>
+            </w:pPr>
+            <w:r>
+              <w:rPr>
+                <w:rFonts w:ascii="Calibri" w:cs="Calibri" w:eastAsia="Calibri" w:hAnsi="Calibri"/>
+                <w:color w:val="1F2937"/>
+                <w:sz w:val="14"/>
+                <w:szCs w:val="14"/>
+              </w:rPr>
+              <w:t xml:space="preserve">Transcribed text plus workspace context</w:t>
+            </w:r>
+          </w:p>
+        </w:tc>
+        <w:tc>
+          <w:tcPr>
+            <w:tcW w:type="dxa" w:w="1600"/>
+            <w:shd w:fill="EEF3F8" w:color="auto" w:val="clear"/>
+            <w:tcMar>
+              <w:top w:type="dxa" w:w="60"/>
+              <w:left w:type="dxa" w:w="90"/>
+              <w:bottom w:type="dxa" w:w="60"/>
+              <w:right w:type="dxa" w:w="90"/>
+            </w:tcMar>
+          </w:tcPr>
+          <w:p>
+            <w:pPr>
+              <w:spacing w:after="0" w:before="0" w:line="250"/>
+              <w:jc w:val="left"/>
+            </w:pPr>
+            <w:r>
+              <w:rPr>
+                <w:rFonts w:ascii="Calibri" w:cs="Calibri" w:eastAsia="Calibri" w:hAnsi="Calibri"/>
+                <w:color w:val="1F2937"/>
+                <w:sz w:val="14"/>
+                <w:szCs w:val="14"/>
+              </w:rPr>
+              <w:t xml:space="preserve">Typed intent with parameters, or an explicit unknown</w:t>
+            </w:r>
+          </w:p>
+        </w:tc>
+        <w:tc>
+          <w:tcPr>
+            <w:tcW w:type="dxa" w:w="1520"/>
+            <w:shd w:fill="EEF3F8" w:color="auto" w:val="clear"/>
+            <w:tcMar>
+              <w:top w:type="dxa" w:w="60"/>
+              <w:left w:type="dxa" w:w="90"/>
+              <w:bottom w:type="dxa" w:w="60"/>
+              <w:right w:type="dxa" w:w="90"/>
+            </w:tcMar>
+          </w:tcPr>
+          <w:p>
+            <w:pPr>
+              <w:spacing w:after="0" w:before="0" w:line="250"/>
+              <w:jc w:val="left"/>
+            </w:pPr>
+            <w:r>
+              <w:rPr>
+                <w:rFonts w:ascii="Calibri" w:cs="Calibri" w:eastAsia="Calibri" w:hAnsi="Calibri"/>
+                <w:color w:val="1F2937"/>
+                <w:sz w:val="14"/>
+                <w:szCs w:val="14"/>
+              </w:rPr>
               <w:t xml:space="preserve">Enables hands-free navigation during a board session</w:t>
             </w:r>
           </w:p>
@@ -6659,6 +6826,7 @@
         <w:tc>
           <w:tcPr>
             <w:tcW w:type="dxa" w:w="1520"/>
+            <w:shd w:fill="EEF3F8" w:color="auto" w:val="clear"/>
             <w:tcMar>
               <w:top w:type="dxa" w:w="60"/>
               <w:left w:type="dxa" w:w="90"/>
@@ -6707,7 +6875,7 @@
           <w:sz w:val="21"/>
           <w:szCs w:val="21"/>
         </w:rPr>
-        <w:t xml:space="preserve">The governance boundary is architectural, not advisory. Every route receives pre-computed figures and is instructed never to recalculate; every response is labelled as advisory and carries its provenance, so a reader can see whether they are looking at a model response or the deterministic fallback.</w:t>
+        <w:t xml:space="preserve">The governance boundary is architectural, not advisory. Every route receives pre-computed figures and is instructed never to recalculate; every response is labelled as advisory and carries its provenance, so a reader can see whether they are looking at a model response or the deterministic fallback. User text is screened for instruction-override attempts and redacted for personal data before it is forwarded, and outbound network access is restricted to the model provider alone, so the platform cannot retrieve third-party web content even if asked to.</w:t>
       </w:r>
     </w:p>
     <w:p>
@@ -6740,7 +6908,7 @@
           <w:sz w:val="21"/>
           <w:szCs w:val="21"/>
         </w:rPr>
-        <w:t xml:space="preserve">CapExIQ is a Next.js application with a strictly-typed deterministic finance engine at its core. The executive dashboard carries the six required components: key-performance cards for NPV, IRR, MIRR, PI and payback; an annual free-cash-flow chart with a cumulative line crossing zero in Year 4; a three-scenario comparison; a sensitivity module with a normalised tornado chart and two-dimensional NPV heatmaps; a ranked risk-alert panel; and the AI recommendation panel. Supporting routes cover the assumptions register with provenance badges, a 5,000-iteration Monte Carlo simulation, a capital-portfolio optimiser solving the 0-1 knapsack under capital rationing, debt-covenant analysis, the labour-savings bridge and a print-ready board memorandum.</w:t>
+        <w:t xml:space="preserve">CapExIQ is a Next.js application with a strictly-typed deterministic finance engine at its core. The executive dashboard carries the six required components: key-performance cards for NPV, IRR, MIRR, PI and payback; an annual free-cash-flow chart with a cumulative line crossing zero in Year 4; a three-scenario comparison; a sensitivity module with a normalised tornado chart and two-dimensional NPV heatmaps; a ranked risk-alert panel; and the AI recommendation panel. Supporting routes cover the assumptions register, a 5,000-iteration Monte Carlo simulation, a portfolio optimiser solving the 0-1 knapsack under capital rationing, covenant analysis and a print-ready board memorandum.</w:t>
       </w:r>
     </w:p>
     <w:p>
@@ -8059,6 +8227,19 @@
           <w:szCs w:val="21"/>
         </w:rPr>
         <w:t xml:space="preserve">That five of the eight default cases fail is deliberate. A template pack in which every archetype is comfortably profitable would demonstrate optimistic defaults rather than a working engine.</w:t>
+      </w:r>
+    </w:p>
+    <w:p>
+      <w:pPr>
+        <w:spacing w:after="120" w:before="0" w:line="276"/>
+      </w:pPr>
+      <w:r>
+        <w:rPr>
+          <w:rFonts w:ascii="Calibri" w:cs="Calibri" w:eastAsia="Calibri" w:hAnsi="Calibri"/>
+          <w:sz w:val="21"/>
+          <w:szCs w:val="21"/>
+        </w:rPr>
+        <w:t xml:space="preserve">Access is governed rather than cosmetic. Six executive roles map to twenty permissions, and authorisation is decided from a signed session cookie before a page renders, so the funding structure and the approval workflow cannot be reached by changing a setting in the interface.</w:t>
       </w:r>
     </w:p>
     <w:p>
@@ -9610,6 +9791,65 @@
                 <w:sz w:val="17"/>
                 <w:szCs w:val="17"/>
               </w:rPr>
+              <w:t xml:space="preserve">Presenting generated content as observed</w:t>
+            </w:r>
+          </w:p>
+        </w:tc>
+        <w:tc>
+          <w:tcPr>
+            <w:tcW w:type="dxa" w:w="7360"/>
+            <w:tcMar>
+              <w:top w:type="dxa" w:w="60"/>
+              <w:left w:type="dxa" w:w="90"/>
+              <w:bottom w:type="dxa" w:w="60"/>
+              <w:right w:type="dxa" w:w="90"/>
+            </w:tcMar>
+          </w:tcPr>
+          <w:p>
+            <w:pPr>
+              <w:spacing w:after="0" w:before="0" w:line="250"/>
+              <w:jc w:val="left"/>
+            </w:pPr>
+            <w:r>
+              <w:rPr>
+                <w:rFonts w:ascii="Calibri" w:cs="Calibri" w:eastAsia="Calibri" w:hAnsi="Calibri"/>
+                <w:color w:val="1F2937"/>
+                <w:sz w:val="17"/>
+                <w:szCs w:val="17"/>
+              </w:rPr>
+              <w:t xml:space="preserve">A generated figure displayed as a market observation is indistinguishable from a real one. Any panel that cannot cite a source is now labelled as not live and carries the as-of date of the document its values were transcribed from</w:t>
+            </w:r>
+          </w:p>
+        </w:tc>
+      </w:tr>
+      <w:tr>
+        <w:trPr>
+          <w:cantSplit/>
+          <w:tblHeader w:val="false"/>
+        </w:trPr>
+        <w:tc>
+          <w:tcPr>
+            <w:tcW w:type="dxa" w:w="2000"/>
+            <w:shd w:fill="EEF3F8" w:color="auto" w:val="clear"/>
+            <w:tcMar>
+              <w:top w:type="dxa" w:w="60"/>
+              <w:left w:type="dxa" w:w="90"/>
+              <w:bottom w:type="dxa" w:w="60"/>
+              <w:right w:type="dxa" w:w="90"/>
+            </w:tcMar>
+          </w:tcPr>
+          <w:p>
+            <w:pPr>
+              <w:spacing w:after="0" w:before="0" w:line="250"/>
+              <w:jc w:val="left"/>
+            </w:pPr>
+            <w:r>
+              <w:rPr>
+                <w:rFonts w:ascii="Calibri" w:cs="Calibri" w:eastAsia="Calibri" w:hAnsi="Calibri"/>
+                <w:color w:val="1F2937"/>
+                <w:sz w:val="17"/>
+                <w:szCs w:val="17"/>
+              </w:rPr>
               <w:t xml:space="preserve">Responsibility</w:t>
             </w:r>
           </w:p>
@@ -9617,6 +9857,7 @@
         <w:tc>
           <w:tcPr>
             <w:tcW w:type="dxa" w:w="7360"/>
+            <w:shd w:fill="EEF3F8" w:color="auto" w:val="clear"/>
             <w:tcMar>
               <w:top w:type="dxa" w:w="60"/>
               <w:left w:type="dxa" w:w="90"/>
@@ -9642,6 +9883,42 @@
         </w:tc>
       </w:tr>
     </w:tbl>
+    <w:p>
+      <w:pPr>
+        <w:spacing w:after="100"/>
+      </w:pPr>
+      <w:r>
+        <w:rPr>
+          <w:rFonts w:ascii="Calibri" w:cs="Calibri" w:eastAsia="Calibri" w:hAnsi="Calibri"/>
+          <w:sz w:val="21"/>
+          <w:szCs w:val="21"/>
+        </w:rPr>
+        <w:t xml:space="preserve"/>
+      </w:r>
+    </w:p>
+    <w:p>
+      <w:pPr>
+        <w:spacing w:after="120" w:before="0" w:line="276"/>
+      </w:pPr>
+      <w:r>
+        <w:rPr>
+          <w:rFonts w:ascii="Calibri" w:cs="Calibri" w:eastAsia="Calibri" w:hAnsi="Calibri"/>
+          <w:b/>
+          <w:bCs/>
+          <w:sz w:val="21"/>
+          <w:szCs w:val="21"/>
+        </w:rPr>
+        <w:t xml:space="preserve">One of these risks was found in our own build, which is the reason the row above exists. </w:t>
+      </w:r>
+      <w:r>
+        <w:rPr>
+          <w:rFonts w:ascii="Calibri" w:cs="Calibri" w:eastAsia="Calibri" w:hAnsi="Calibri"/>
+          <w:sz w:val="21"/>
+          <w:szCs w:val="21"/>
+        </w:rPr>
+        <w:t xml:space="preserve">An earlier version of the macroeconomic panel prompted the model to act as a real-time data ingestion agent and published the result as observed market data. No external source was ever contacted: every interbank rate, utility tariff and lease price on that panel had been generated by the model and shown to a capital committee as fact. The generation step was removed and replaced with hand-transcribed values carrying citations and as-of dates. It is recorded here because it illustrates the central ethical risk precisely — not that a model states something false, but that a well-designed interface can make a generated figure look exactly like a measured one.</w:t>
+      </w:r>
+    </w:p>
     <w:p>
       <w:pPr>
         <w:spacing w:after="160"/>

</xml_diff>

<commit_message>
feat: wire real AI advisory, add Tier 1 decision-intelligence features, fix E2E auth, close brief gaps
</commit_message>
<xml_diff>
--- a/submissions/CapExIQ_Individual_Report.docx
+++ b/submissions/CapExIQ_Individual_Report.docx
@@ -597,7 +597,7 @@
           <w:sz w:val="21"/>
           <w:szCs w:val="21"/>
         </w:rPr>
-        <w:t xml:space="preserve">CapExIQ is not a single-purpose calculator. It ships eight investment archetypes spanning the capital decisions named in the brief, and twelve AI capabilities, each degrading to a deterministic fallback when no model is available.</w:t>
+        <w:t xml:space="preserve">CapExIQ is not a single-purpose calculator. It ships eight investment archetypes spanning the capital decisions named in the brief, and sixteen AI capabilities, each degrading to a deterministic fallback when no model is available.</w:t>
       </w:r>
     </w:p>
     <w:tbl>
@@ -4668,7 +4668,7 @@
           <w:sz w:val="21"/>
           <w:szCs w:val="21"/>
         </w:rPr>
-        <w:t xml:space="preserve">AI improves the work in four ways: it compresses drafting from hours to seconds, it interrogates assumptions from perspectives an author would not volunteer, it makes the model addressable in natural language by directors who will not open a spreadsheet, and it structures unstructured inputs such as vendor quotations. It does not improve the arithmetic and is deliberately prevented from touching it. Twelve capabilities are implemented; each degrades to a deterministic fallback, so the platform is fully functional with no API key.</w:t>
+        <w:t xml:space="preserve">AI improves the work in four ways: it compresses drafting from hours to seconds, it interrogates assumptions from perspectives an author would not volunteer, it makes the model addressable in natural language by directors who will not open a spreadsheet, and it structures unstructured inputs such as vendor quotations. It does not improve the arithmetic and is deliberately prevented from touching it. Sixteen capabilities are implemented; each degrades to a deterministic fallback, so the platform is fully functional with no API key.</w:t>
       </w:r>
     </w:p>
     <w:tbl>
@@ -6435,7 +6435,7 @@
                 <w:sz w:val="14"/>
                 <w:szCs w:val="14"/>
               </w:rPr>
-              <w:t xml:space="preserve">A 112-passage corpus built from the methodology, assumption register and scenario definitions</w:t>
+              <w:t xml:space="preserve">A 90-passage corpus built from the methodology, assumption register and scenario definitions</w:t>
             </w:r>
           </w:p>
         </w:tc>
@@ -6679,6 +6679,666 @@
                 <w:szCs w:val="14"/>
               </w:rPr>
               <w:t xml:space="preserve">Values are point-in-time and must be re-transcribed as sources are revised</w:t>
+            </w:r>
+          </w:p>
+        </w:tc>
+      </w:tr>
+      <w:tr>
+        <w:trPr>
+          <w:cantSplit/>
+          <w:tblHeader w:val="false"/>
+        </w:trPr>
+        <w:tc>
+          <w:tcPr>
+            <w:tcW w:type="dxa" w:w="1420"/>
+            <w:shd w:fill="EEF3F8" w:color="auto" w:val="clear"/>
+            <w:tcMar>
+              <w:top w:type="dxa" w:w="60"/>
+              <w:left w:type="dxa" w:w="90"/>
+              <w:bottom w:type="dxa" w:w="60"/>
+              <w:right w:type="dxa" w:w="90"/>
+            </w:tcMar>
+          </w:tcPr>
+          <w:p>
+            <w:pPr>
+              <w:spacing w:after="0" w:before="0" w:line="250"/>
+              <w:jc w:val="left"/>
+            </w:pPr>
+            <w:r>
+              <w:rPr>
+                <w:rFonts w:ascii="Calibri" w:cs="Calibri" w:eastAsia="Calibri" w:hAnsi="Calibri"/>
+                <w:color w:val="1F2937"/>
+                <w:sz w:val="14"/>
+                <w:szCs w:val="14"/>
+              </w:rPr>
+              <w:t xml:space="preserve">Driver attribution</w:t>
+            </w:r>
+          </w:p>
+        </w:tc>
+        <w:tc>
+          <w:tcPr>
+            <w:tcW w:type="dxa" w:w="1720"/>
+            <w:shd w:fill="EEF3F8" w:color="auto" w:val="clear"/>
+            <w:tcMar>
+              <w:top w:type="dxa" w:w="60"/>
+              <w:left w:type="dxa" w:w="90"/>
+              <w:bottom w:type="dxa" w:w="60"/>
+              <w:right w:type="dxa" w:w="90"/>
+            </w:tcMar>
+          </w:tcPr>
+          <w:p>
+            <w:pPr>
+              <w:spacing w:after="0" w:before="0" w:line="250"/>
+              <w:jc w:val="left"/>
+            </w:pPr>
+            <w:r>
+              <w:rPr>
+                <w:rFonts w:ascii="Calibri" w:cs="Calibri" w:eastAsia="Calibri" w:hAnsi="Calibri"/>
+                <w:color w:val="1F2937"/>
+                <w:sz w:val="14"/>
+                <w:szCs w:val="14"/>
+              </w:rPr>
+              <w:t xml:space="preserve">Decomposes a change in net present value into the contribution of each assumption</w:t>
+            </w:r>
+          </w:p>
+        </w:tc>
+        <w:tc>
+          <w:tcPr>
+            <w:tcW w:type="dxa" w:w="1580"/>
+            <w:shd w:fill="EEF3F8" w:color="auto" w:val="clear"/>
+            <w:tcMar>
+              <w:top w:type="dxa" w:w="60"/>
+              <w:left w:type="dxa" w:w="90"/>
+              <w:bottom w:type="dxa" w:w="60"/>
+              <w:right w:type="dxa" w:w="90"/>
+            </w:tcMar>
+          </w:tcPr>
+          <w:p>
+            <w:pPr>
+              <w:spacing w:after="0" w:before="0" w:line="250"/>
+              <w:jc w:val="left"/>
+            </w:pPr>
+            <w:r>
+              <w:rPr>
+                <w:rFonts w:ascii="Calibri" w:cs="Calibri" w:eastAsia="Calibri" w:hAnsi="Calibri"/>
+                <w:color w:val="1F2937"/>
+                <w:sz w:val="14"/>
+                <w:szCs w:val="14"/>
+              </w:rPr>
+              <w:t xml:space="preserve">Two assumption sets and the engine output for each</w:t>
+            </w:r>
+          </w:p>
+        </w:tc>
+        <w:tc>
+          <w:tcPr>
+            <w:tcW w:type="dxa" w:w="1600"/>
+            <w:shd w:fill="EEF3F8" w:color="auto" w:val="clear"/>
+            <w:tcMar>
+              <w:top w:type="dxa" w:w="60"/>
+              <w:left w:type="dxa" w:w="90"/>
+              <w:bottom w:type="dxa" w:w="60"/>
+              <w:right w:type="dxa" w:w="90"/>
+            </w:tcMar>
+          </w:tcPr>
+          <w:p>
+            <w:pPr>
+              <w:spacing w:after="0" w:before="0" w:line="250"/>
+              <w:jc w:val="left"/>
+            </w:pPr>
+            <w:r>
+              <w:rPr>
+                <w:rFonts w:ascii="Calibri" w:cs="Calibri" w:eastAsia="Calibri" w:hAnsi="Calibri"/>
+                <w:color w:val="1F2937"/>
+                <w:sz w:val="14"/>
+                <w:szCs w:val="14"/>
+              </w:rPr>
+              <w:t xml:space="preserve">A ranked contribution per driver that reconciles exactly to the total movement</w:t>
+            </w:r>
+          </w:p>
+        </w:tc>
+        <w:tc>
+          <w:tcPr>
+            <w:tcW w:type="dxa" w:w="1520"/>
+            <w:shd w:fill="EEF3F8" w:color="auto" w:val="clear"/>
+            <w:tcMar>
+              <w:top w:type="dxa" w:w="60"/>
+              <w:left w:type="dxa" w:w="90"/>
+              <w:bottom w:type="dxa" w:w="60"/>
+              <w:right w:type="dxa" w:w="90"/>
+            </w:tcMar>
+          </w:tcPr>
+          <w:p>
+            <w:pPr>
+              <w:spacing w:after="0" w:before="0" w:line="250"/>
+              <w:jc w:val="left"/>
+            </w:pPr>
+            <w:r>
+              <w:rPr>
+                <w:rFonts w:ascii="Calibri" w:cs="Calibri" w:eastAsia="Calibri" w:hAnsi="Calibri"/>
+                <w:color w:val="1F2937"/>
+                <w:sz w:val="14"/>
+                <w:szCs w:val="14"/>
+              </w:rPr>
+              <w:t xml:space="preserve">Answers why a number moved, not merely that it moved</w:t>
+            </w:r>
+          </w:p>
+        </w:tc>
+        <w:tc>
+          <w:tcPr>
+            <w:tcW w:type="dxa" w:w="1520"/>
+            <w:shd w:fill="EEF3F8" w:color="auto" w:val="clear"/>
+            <w:tcMar>
+              <w:top w:type="dxa" w:w="60"/>
+              <w:left w:type="dxa" w:w="90"/>
+              <w:bottom w:type="dxa" w:w="60"/>
+              <w:right w:type="dxa" w:w="90"/>
+            </w:tcMar>
+          </w:tcPr>
+          <w:p>
+            <w:pPr>
+              <w:spacing w:after="0" w:before="0" w:line="250"/>
+              <w:jc w:val="left"/>
+            </w:pPr>
+            <w:r>
+              <w:rPr>
+                <w:rFonts w:ascii="Calibri" w:cs="Calibri" w:eastAsia="Calibri" w:hAnsi="Calibri"/>
+                <w:color w:val="1F2937"/>
+                <w:sz w:val="14"/>
+                <w:szCs w:val="14"/>
+              </w:rPr>
+              <w:t xml:space="preserve">Attributed shares depend on a fixed substitution order, which is documented rather than chosen per call</w:t>
+            </w:r>
+          </w:p>
+        </w:tc>
+      </w:tr>
+      <w:tr>
+        <w:trPr>
+          <w:cantSplit/>
+          <w:tblHeader w:val="false"/>
+        </w:trPr>
+        <w:tc>
+          <w:tcPr>
+            <w:tcW w:type="dxa" w:w="1420"/>
+            <w:tcMar>
+              <w:top w:type="dxa" w:w="60"/>
+              <w:left w:type="dxa" w:w="90"/>
+              <w:bottom w:type="dxa" w:w="60"/>
+              <w:right w:type="dxa" w:w="90"/>
+            </w:tcMar>
+          </w:tcPr>
+          <w:p>
+            <w:pPr>
+              <w:spacing w:after="0" w:before="0" w:line="250"/>
+              <w:jc w:val="left"/>
+            </w:pPr>
+            <w:r>
+              <w:rPr>
+                <w:rFonts w:ascii="Calibri" w:cs="Calibri" w:eastAsia="Calibri" w:hAnsi="Calibri"/>
+                <w:color w:val="1F2937"/>
+                <w:sz w:val="14"/>
+                <w:szCs w:val="14"/>
+              </w:rPr>
+              <w:t xml:space="preserve">Fitted cash-flow forecast</w:t>
+            </w:r>
+          </w:p>
+        </w:tc>
+        <w:tc>
+          <w:tcPr>
+            <w:tcW w:type="dxa" w:w="1720"/>
+            <w:tcMar>
+              <w:top w:type="dxa" w:w="60"/>
+              <w:left w:type="dxa" w:w="90"/>
+              <w:bottom w:type="dxa" w:w="60"/>
+              <w:right w:type="dxa" w:w="90"/>
+            </w:tcMar>
+          </w:tcPr>
+          <w:p>
+            <w:pPr>
+              <w:spacing w:after="0" w:before="0" w:line="250"/>
+              <w:jc w:val="left"/>
+            </w:pPr>
+            <w:r>
+              <w:rPr>
+                <w:rFonts w:ascii="Calibri" w:cs="Calibri" w:eastAsia="Calibri" w:hAnsi="Calibri"/>
+                <w:color w:val="1F2937"/>
+                <w:sz w:val="14"/>
+                <w:szCs w:val="14"/>
+              </w:rPr>
+              <w:t xml:space="preserve">Fits the benefit growth rate to an observed series and projects it with uncertainty bands</w:t>
+            </w:r>
+          </w:p>
+        </w:tc>
+        <w:tc>
+          <w:tcPr>
+            <w:tcW w:type="dxa" w:w="1580"/>
+            <w:tcMar>
+              <w:top w:type="dxa" w:w="60"/>
+              <w:left w:type="dxa" w:w="90"/>
+              <w:bottom w:type="dxa" w:w="60"/>
+              <w:right w:type="dxa" w:w="90"/>
+            </w:tcMar>
+          </w:tcPr>
+          <w:p>
+            <w:pPr>
+              <w:spacing w:after="0" w:before="0" w:line="250"/>
+              <w:jc w:val="left"/>
+            </w:pPr>
+            <w:r>
+              <w:rPr>
+                <w:rFonts w:ascii="Calibri" w:cs="Calibri" w:eastAsia="Calibri" w:hAnsi="Calibri"/>
+                <w:color w:val="1F2937"/>
+                <w:sz w:val="14"/>
+                <w:szCs w:val="14"/>
+              </w:rPr>
+              <w:t xml:space="preserve">Historical operational spend, by least squares on log values</w:t>
+            </w:r>
+          </w:p>
+        </w:tc>
+        <w:tc>
+          <w:tcPr>
+            <w:tcW w:type="dxa" w:w="1600"/>
+            <w:tcMar>
+              <w:top w:type="dxa" w:w="60"/>
+              <w:left w:type="dxa" w:w="90"/>
+              <w:bottom w:type="dxa" w:w="60"/>
+              <w:right w:type="dxa" w:w="90"/>
+            </w:tcMar>
+          </w:tcPr>
+          <w:p>
+            <w:pPr>
+              <w:spacing w:after="0" w:before="0" w:line="250"/>
+              <w:jc w:val="left"/>
+            </w:pPr>
+            <w:r>
+              <w:rPr>
+                <w:rFonts w:ascii="Calibri" w:cs="Calibri" w:eastAsia="Calibri" w:hAnsi="Calibri"/>
+                <w:color w:val="1F2937"/>
+                <w:sz w:val="14"/>
+                <w:szCs w:val="14"/>
+              </w:rPr>
+              <w:t xml:space="preserve">P10, P50 and P90 paths whose width derives from the regression standard error</w:t>
+            </w:r>
+          </w:p>
+        </w:tc>
+        <w:tc>
+          <w:tcPr>
+            <w:tcW w:type="dxa" w:w="1520"/>
+            <w:tcMar>
+              <w:top w:type="dxa" w:w="60"/>
+              <w:left w:type="dxa" w:w="90"/>
+              <w:bottom w:type="dxa" w:w="60"/>
+              <w:right w:type="dxa" w:w="90"/>
+            </w:tcMar>
+          </w:tcPr>
+          <w:p>
+            <w:pPr>
+              <w:spacing w:after="0" w:before="0" w:line="250"/>
+              <w:jc w:val="left"/>
+            </w:pPr>
+            <w:r>
+              <w:rPr>
+                <w:rFonts w:ascii="Calibri" w:cs="Calibri" w:eastAsia="Calibri" w:hAnsi="Calibri"/>
+                <w:color w:val="1F2937"/>
+                <w:sz w:val="14"/>
+                <w:szCs w:val="14"/>
+              </w:rPr>
+              <w:t xml:space="preserve">Replaces an assumed growth rate with a fitted one, and shows how uncertain it is</w:t>
+            </w:r>
+          </w:p>
+        </w:tc>
+        <w:tc>
+          <w:tcPr>
+            <w:tcW w:type="dxa" w:w="1520"/>
+            <w:tcMar>
+              <w:top w:type="dxa" w:w="60"/>
+              <w:left w:type="dxa" w:w="90"/>
+              <w:bottom w:type="dxa" w:w="60"/>
+              <w:right w:type="dxa" w:w="90"/>
+            </w:tcMar>
+          </w:tcPr>
+          <w:p>
+            <w:pPr>
+              <w:spacing w:after="0" w:before="0" w:line="250"/>
+              <w:jc w:val="left"/>
+            </w:pPr>
+            <w:r>
+              <w:rPr>
+                <w:rFonts w:ascii="Calibri" w:cs="Calibri" w:eastAsia="Calibri" w:hAnsi="Calibri"/>
+                <w:color w:val="1F2937"/>
+                <w:sz w:val="14"/>
+                <w:szCs w:val="14"/>
+              </w:rPr>
+              <w:t xml:space="preserve">A log-linear trend fit with no seasonality or autocorrelation term; it declines to fit fewer than four observations</w:t>
+            </w:r>
+          </w:p>
+        </w:tc>
+      </w:tr>
+      <w:tr>
+        <w:trPr>
+          <w:cantSplit/>
+          <w:tblHeader w:val="false"/>
+        </w:trPr>
+        <w:tc>
+          <w:tcPr>
+            <w:tcW w:type="dxa" w:w="1420"/>
+            <w:shd w:fill="EEF3F8" w:color="auto" w:val="clear"/>
+            <w:tcMar>
+              <w:top w:type="dxa" w:w="60"/>
+              <w:left w:type="dxa" w:w="90"/>
+              <w:bottom w:type="dxa" w:w="60"/>
+              <w:right w:type="dxa" w:w="90"/>
+            </w:tcMar>
+          </w:tcPr>
+          <w:p>
+            <w:pPr>
+              <w:spacing w:after="0" w:before="0" w:line="250"/>
+              <w:jc w:val="left"/>
+            </w:pPr>
+            <w:r>
+              <w:rPr>
+                <w:rFonts w:ascii="Calibri" w:cs="Calibri" w:eastAsia="Calibri" w:hAnsi="Calibri"/>
+                <w:color w:val="1F2937"/>
+                <w:sz w:val="14"/>
+                <w:szCs w:val="14"/>
+              </w:rPr>
+              <w:t xml:space="preserve">Assumption screening</w:t>
+            </w:r>
+          </w:p>
+        </w:tc>
+        <w:tc>
+          <w:tcPr>
+            <w:tcW w:type="dxa" w:w="1720"/>
+            <w:shd w:fill="EEF3F8" w:color="auto" w:val="clear"/>
+            <w:tcMar>
+              <w:top w:type="dxa" w:w="60"/>
+              <w:left w:type="dxa" w:w="90"/>
+              <w:bottom w:type="dxa" w:w="60"/>
+              <w:right w:type="dxa" w:w="90"/>
+            </w:tcMar>
+          </w:tcPr>
+          <w:p>
+            <w:pPr>
+              <w:spacing w:after="0" w:before="0" w:line="250"/>
+              <w:jc w:val="left"/>
+            </w:pPr>
+            <w:r>
+              <w:rPr>
+                <w:rFonts w:ascii="Calibri" w:cs="Calibri" w:eastAsia="Calibri" w:hAnsi="Calibri"/>
+                <w:color w:val="1F2937"/>
+                <w:sz w:val="14"/>
+                <w:szCs w:val="14"/>
+              </w:rPr>
+              <w:t xml:space="preserve">Screens inputs against plausible ranges before the engine evaluates them</w:t>
+            </w:r>
+          </w:p>
+        </w:tc>
+        <w:tc>
+          <w:tcPr>
+            <w:tcW w:type="dxa" w:w="1580"/>
+            <w:shd w:fill="EEF3F8" w:color="auto" w:val="clear"/>
+            <w:tcMar>
+              <w:top w:type="dxa" w:w="60"/>
+              <w:left w:type="dxa" w:w="90"/>
+              <w:bottom w:type="dxa" w:w="60"/>
+              <w:right w:type="dxa" w:w="90"/>
+            </w:tcMar>
+          </w:tcPr>
+          <w:p>
+            <w:pPr>
+              <w:spacing w:after="0" w:before="0" w:line="250"/>
+              <w:jc w:val="left"/>
+            </w:pPr>
+            <w:r>
+              <w:rPr>
+                <w:rFonts w:ascii="Calibri" w:cs="Calibri" w:eastAsia="Calibri" w:hAnsi="Calibri"/>
+                <w:color w:val="1F2937"/>
+                <w:sz w:val="14"/>
+                <w:szCs w:val="14"/>
+              </w:rPr>
+              <w:t xml:space="preserve">The assumption register and its stated ranges</w:t>
+            </w:r>
+          </w:p>
+        </w:tc>
+        <w:tc>
+          <w:tcPr>
+            <w:tcW w:type="dxa" w:w="1600"/>
+            <w:shd w:fill="EEF3F8" w:color="auto" w:val="clear"/>
+            <w:tcMar>
+              <w:top w:type="dxa" w:w="60"/>
+              <w:left w:type="dxa" w:w="90"/>
+              <w:bottom w:type="dxa" w:w="60"/>
+              <w:right w:type="dxa" w:w="90"/>
+            </w:tcMar>
+          </w:tcPr>
+          <w:p>
+            <w:pPr>
+              <w:spacing w:after="0" w:before="0" w:line="250"/>
+              <w:jc w:val="left"/>
+            </w:pPr>
+            <w:r>
+              <w:rPr>
+                <w:rFonts w:ascii="Calibri" w:cs="Calibri" w:eastAsia="Calibri" w:hAnsi="Calibri"/>
+                <w:color w:val="1F2937"/>
+                <w:sz w:val="14"/>
+                <w:szCs w:val="14"/>
+              </w:rPr>
+              <w:t xml:space="preserve">Severity-ranked findings naming the expectation breached and the consequence</w:t>
+            </w:r>
+          </w:p>
+        </w:tc>
+        <w:tc>
+          <w:tcPr>
+            <w:tcW w:type="dxa" w:w="1520"/>
+            <w:shd w:fill="EEF3F8" w:color="auto" w:val="clear"/>
+            <w:tcMar>
+              <w:top w:type="dxa" w:w="60"/>
+              <w:left w:type="dxa" w:w="90"/>
+              <w:bottom w:type="dxa" w:w="60"/>
+              <w:right w:type="dxa" w:w="90"/>
+            </w:tcMar>
+          </w:tcPr>
+          <w:p>
+            <w:pPr>
+              <w:spacing w:after="0" w:before="0" w:line="250"/>
+              <w:jc w:val="left"/>
+            </w:pPr>
+            <w:r>
+              <w:rPr>
+                <w:rFonts w:ascii="Calibri" w:cs="Calibri" w:eastAsia="Calibri" w:hAnsi="Calibri"/>
+                <w:color w:val="1F2937"/>
+                <w:sz w:val="14"/>
+                <w:szCs w:val="14"/>
+              </w:rPr>
+              <w:t xml:space="preserve">Catches an implausible input before it is discounted, charted and written into a memorandum</w:t>
+            </w:r>
+          </w:p>
+        </w:tc>
+        <w:tc>
+          <w:tcPr>
+            <w:tcW w:type="dxa" w:w="1520"/>
+            <w:shd w:fill="EEF3F8" w:color="auto" w:val="clear"/>
+            <w:tcMar>
+              <w:top w:type="dxa" w:w="60"/>
+              <w:left w:type="dxa" w:w="90"/>
+              <w:bottom w:type="dxa" w:w="60"/>
+              <w:right w:type="dxa" w:w="90"/>
+            </w:tcMar>
+          </w:tcPr>
+          <w:p>
+            <w:pPr>
+              <w:spacing w:after="0" w:before="0" w:line="250"/>
+              <w:jc w:val="left"/>
+            </w:pPr>
+            <w:r>
+              <w:rPr>
+                <w:rFonts w:ascii="Calibri" w:cs="Calibri" w:eastAsia="Calibri" w:hAnsi="Calibri"/>
+                <w:color w:val="1F2937"/>
+                <w:sz w:val="14"/>
+                <w:szCs w:val="14"/>
+              </w:rPr>
+              <w:t xml:space="preserve">Range checks detect only what they were written to detect</w:t>
+            </w:r>
+          </w:p>
+        </w:tc>
+      </w:tr>
+      <w:tr>
+        <w:trPr>
+          <w:cantSplit/>
+          <w:tblHeader w:val="false"/>
+        </w:trPr>
+        <w:tc>
+          <w:tcPr>
+            <w:tcW w:type="dxa" w:w="1420"/>
+            <w:tcMar>
+              <w:top w:type="dxa" w:w="60"/>
+              <w:left w:type="dxa" w:w="90"/>
+              <w:bottom w:type="dxa" w:w="60"/>
+              <w:right w:type="dxa" w:w="90"/>
+            </w:tcMar>
+          </w:tcPr>
+          <w:p>
+            <w:pPr>
+              <w:spacing w:after="0" w:before="0" w:line="250"/>
+              <w:jc w:val="left"/>
+            </w:pPr>
+            <w:r>
+              <w:rPr>
+                <w:rFonts w:ascii="Calibri" w:cs="Calibri" w:eastAsia="Calibri" w:hAnsi="Calibri"/>
+                <w:color w:val="1F2937"/>
+                <w:sz w:val="14"/>
+                <w:szCs w:val="14"/>
+              </w:rPr>
+              <w:t xml:space="preserve">Governing-measure selection</w:t>
+            </w:r>
+          </w:p>
+        </w:tc>
+        <w:tc>
+          <w:tcPr>
+            <w:tcW w:type="dxa" w:w="1720"/>
+            <w:tcMar>
+              <w:top w:type="dxa" w:w="60"/>
+              <w:left w:type="dxa" w:w="90"/>
+              <w:bottom w:type="dxa" w:w="60"/>
+              <w:right w:type="dxa" w:w="90"/>
+            </w:tcMar>
+          </w:tcPr>
+          <w:p>
+            <w:pPr>
+              <w:spacing w:after="0" w:before="0" w:line="250"/>
+              <w:jc w:val="left"/>
+            </w:pPr>
+            <w:r>
+              <w:rPr>
+                <w:rFonts w:ascii="Calibri" w:cs="Calibri" w:eastAsia="Calibri" w:hAnsi="Calibri"/>
+                <w:color w:val="1F2937"/>
+                <w:sz w:val="14"/>
+                <w:szCs w:val="14"/>
+              </w:rPr>
+              <w:t xml:space="preserve">States which decision rule governs the comparison at hand and which would mislead</w:t>
+            </w:r>
+          </w:p>
+        </w:tc>
+        <w:tc>
+          <w:tcPr>
+            <w:tcW w:type="dxa" w:w="1580"/>
+            <w:tcMar>
+              <w:top w:type="dxa" w:w="60"/>
+              <w:left w:type="dxa" w:w="90"/>
+              <w:bottom w:type="dxa" w:w="60"/>
+              <w:right w:type="dxa" w:w="90"/>
+            </w:tcMar>
+          </w:tcPr>
+          <w:p>
+            <w:pPr>
+              <w:spacing w:after="0" w:before="0" w:line="250"/>
+              <w:jc w:val="left"/>
+            </w:pPr>
+            <w:r>
+              <w:rPr>
+                <w:rFonts w:ascii="Calibri" w:cs="Calibri" w:eastAsia="Calibri" w:hAnsi="Calibri"/>
+                <w:color w:val="1F2937"/>
+                <w:sz w:val="14"/>
+                <w:szCs w:val="14"/>
+              </w:rPr>
+              <w:t xml:space="preserve">Horizon equality, capital-rationing status and the cash-flow sign pattern</w:t>
+            </w:r>
+          </w:p>
+        </w:tc>
+        <w:tc>
+          <w:tcPr>
+            <w:tcW w:type="dxa" w:w="1600"/>
+            <w:tcMar>
+              <w:top w:type="dxa" w:w="60"/>
+              <w:left w:type="dxa" w:w="90"/>
+              <w:bottom w:type="dxa" w:w="60"/>
+              <w:right w:type="dxa" w:w="90"/>
+            </w:tcMar>
+          </w:tcPr>
+          <w:p>
+            <w:pPr>
+              <w:spacing w:after="0" w:before="0" w:line="250"/>
+              <w:jc w:val="left"/>
+            </w:pPr>
+            <w:r>
+              <w:rPr>
+                <w:rFonts w:ascii="Calibri" w:cs="Calibri" w:eastAsia="Calibri" w:hAnsi="Calibri"/>
+                <w:color w:val="1F2937"/>
+                <w:sz w:val="14"/>
+                <w:szCs w:val="14"/>
+              </w:rPr>
+              <w:t xml:space="preserve">A primary measure, supporting measures, and cautions with reasons</w:t>
+            </w:r>
+          </w:p>
+        </w:tc>
+        <w:tc>
+          <w:tcPr>
+            <w:tcW w:type="dxa" w:w="1520"/>
+            <w:tcMar>
+              <w:top w:type="dxa" w:w="60"/>
+              <w:left w:type="dxa" w:w="90"/>
+              <w:bottom w:type="dxa" w:w="60"/>
+              <w:right w:type="dxa" w:w="90"/>
+            </w:tcMar>
+          </w:tcPr>
+          <w:p>
+            <w:pPr>
+              <w:spacing w:after="0" w:before="0" w:line="250"/>
+              <w:jc w:val="left"/>
+            </w:pPr>
+            <w:r>
+              <w:rPr>
+                <w:rFonts w:ascii="Calibri" w:cs="Calibri" w:eastAsia="Calibri" w:hAnsi="Calibri"/>
+                <w:color w:val="1F2937"/>
+                <w:sz w:val="14"/>
+                <w:szCs w:val="14"/>
+              </w:rPr>
+              <w:t xml:space="preserve">Prevents the common error of applying correct arithmetic to the wrong comparison</w:t>
+            </w:r>
+          </w:p>
+        </w:tc>
+        <w:tc>
+          <w:tcPr>
+            <w:tcW w:type="dxa" w:w="1520"/>
+            <w:tcMar>
+              <w:top w:type="dxa" w:w="60"/>
+              <w:left w:type="dxa" w:w="90"/>
+              <w:bottom w:type="dxa" w:w="60"/>
+              <w:right w:type="dxa" w:w="90"/>
+            </w:tcMar>
+          </w:tcPr>
+          <w:p>
+            <w:pPr>
+              <w:spacing w:after="0" w:before="0" w:line="250"/>
+              <w:jc w:val="left"/>
+            </w:pPr>
+            <w:r>
+              <w:rPr>
+                <w:rFonts w:ascii="Calibri" w:cs="Calibri" w:eastAsia="Calibri" w:hAnsi="Calibri"/>
+                <w:color w:val="1F2937"/>
+                <w:sz w:val="14"/>
+                <w:szCs w:val="14"/>
+              </w:rPr>
+              <w:t xml:space="preserve">Advisory on rule choice only; it does not evaluate the alternatives</w:t>
             </w:r>
           </w:p>
         </w:tc>
@@ -6876,6 +7536,411 @@
           <w:szCs w:val="21"/>
         </w:rPr>
         <w:t xml:space="preserve">The governance boundary is architectural, not advisory. Every route receives pre-computed figures and is instructed never to recalculate; every response is labelled as advisory and carries its provenance, so a reader can see whether they are looking at a model response or the deterministic fallback. User text is screened for instruction-override attempts and redacted for personal data before it is forwarded, and outbound network access is restricted to the model provider alone, so the platform cannot retrieve third-party web content even if asked to.</w:t>
+      </w:r>
+    </w:p>
+    <w:p>
+      <w:pPr>
+        <w:pStyle w:val="Heading2"/>
+        <w:spacing w:after="80" w:before="200"/>
+      </w:pPr>
+      <w:r>
+        <w:rPr>
+          <w:rFonts w:ascii="Calibri" w:cs="Calibri" w:eastAsia="Calibri" w:hAnsi="Calibri"/>
+          <w:b/>
+          <w:bCs/>
+          <w:color w:val="0E7490"/>
+          <w:sz w:val="22"/>
+          <w:szCs w:val="22"/>
+        </w:rPr>
+        <w:t xml:space="preserve">Assistant question and answer transcript</w:t>
+      </w:r>
+    </w:p>
+    <w:tbl>
+      <w:tblPr>
+        <w:tblW w:type="dxa" w:w="9360"/>
+        <w:tblBorders>
+          <w:top w:val="single" w:color="CBD5E1" w:sz="4"/>
+          <w:left w:val="none" w:color="FFFFFF" w:sz="0"/>
+          <w:bottom w:val="single" w:color="CBD5E1" w:sz="4"/>
+          <w:right w:val="none" w:color="FFFFFF" w:sz="0"/>
+          <w:insideH w:val="single" w:color="CBD5E1" w:sz="2"/>
+          <w:insideV w:val="none" w:color="FFFFFF" w:sz="0"/>
+        </w:tblBorders>
+      </w:tblPr>
+      <w:tblGrid>
+        <w:gridCol w:w="2180"/>
+        <w:gridCol w:w="7180"/>
+      </w:tblGrid>
+      <w:tr>
+        <w:trPr>
+          <w:cantSplit/>
+          <w:tblHeader/>
+        </w:trPr>
+        <w:tc>
+          <w:tcPr>
+            <w:tcW w:type="dxa" w:w="2180"/>
+            <w:shd w:fill="0F2740" w:color="auto" w:val="clear"/>
+            <w:tcMar>
+              <w:top w:type="dxa" w:w="60"/>
+              <w:left w:type="dxa" w:w="90"/>
+              <w:bottom w:type="dxa" w:w="60"/>
+              <w:right w:type="dxa" w:w="90"/>
+            </w:tcMar>
+          </w:tcPr>
+          <w:p>
+            <w:pPr>
+              <w:spacing w:after="0" w:before="0" w:line="250"/>
+              <w:jc w:val="left"/>
+            </w:pPr>
+            <w:r>
+              <w:rPr>
+                <w:rFonts w:ascii="Calibri" w:cs="Calibri" w:eastAsia="Calibri" w:hAnsi="Calibri"/>
+                <w:b/>
+                <w:bCs/>
+                <w:color w:val="FFFFFF"/>
+                <w:sz w:val="15"/>
+                <w:szCs w:val="15"/>
+              </w:rPr>
+              <w:t xml:space="preserve">Question put to the assistant</w:t>
+            </w:r>
+          </w:p>
+        </w:tc>
+        <w:tc>
+          <w:tcPr>
+            <w:tcW w:type="dxa" w:w="7180"/>
+            <w:shd w:fill="0F2740" w:color="auto" w:val="clear"/>
+            <w:tcMar>
+              <w:top w:type="dxa" w:w="60"/>
+              <w:left w:type="dxa" w:w="90"/>
+              <w:bottom w:type="dxa" w:w="60"/>
+              <w:right w:type="dxa" w:w="90"/>
+            </w:tcMar>
+          </w:tcPr>
+          <w:p>
+            <w:pPr>
+              <w:spacing w:after="0" w:before="0" w:line="250"/>
+              <w:jc w:val="left"/>
+            </w:pPr>
+            <w:r>
+              <w:rPr>
+                <w:rFonts w:ascii="Calibri" w:cs="Calibri" w:eastAsia="Calibri" w:hAnsi="Calibri"/>
+                <w:b/>
+                <w:bCs/>
+                <w:color w:val="FFFFFF"/>
+                <w:sz w:val="15"/>
+                <w:szCs w:val="15"/>
+              </w:rPr>
+              <w:t xml:space="preserve">Answer returned, with its basis</w:t>
+            </w:r>
+          </w:p>
+        </w:tc>
+      </w:tr>
+      <w:tr>
+        <w:trPr>
+          <w:cantSplit/>
+          <w:tblHeader w:val="false"/>
+        </w:trPr>
+        <w:tc>
+          <w:tcPr>
+            <w:tcW w:type="dxa" w:w="2180"/>
+            <w:tcMar>
+              <w:top w:type="dxa" w:w="60"/>
+              <w:left w:type="dxa" w:w="90"/>
+              <w:bottom w:type="dxa" w:w="60"/>
+              <w:right w:type="dxa" w:w="90"/>
+            </w:tcMar>
+          </w:tcPr>
+          <w:p>
+            <w:pPr>
+              <w:spacing w:after="0" w:before="0" w:line="250"/>
+              <w:jc w:val="left"/>
+            </w:pPr>
+            <w:r>
+              <w:rPr>
+                <w:rFonts w:ascii="Calibri" w:cs="Calibri" w:eastAsia="Calibri" w:hAnsi="Calibri"/>
+                <w:color w:val="1F2937"/>
+                <w:sz w:val="15"/>
+                <w:szCs w:val="15"/>
+              </w:rPr>
+              <w:t xml:space="preserve">Why did the NPV decrease?</w:t>
+            </w:r>
+          </w:p>
+        </w:tc>
+        <w:tc>
+          <w:tcPr>
+            <w:tcW w:type="dxa" w:w="7180"/>
+            <w:tcMar>
+              <w:top w:type="dxa" w:w="60"/>
+              <w:left w:type="dxa" w:w="90"/>
+              <w:bottom w:type="dxa" w:w="60"/>
+              <w:right w:type="dxa" w:w="90"/>
+            </w:tcMar>
+          </w:tcPr>
+          <w:p>
+            <w:pPr>
+              <w:spacing w:after="0" w:before="0" w:line="250"/>
+              <w:jc w:val="left"/>
+            </w:pPr>
+            <w:r>
+              <w:rPr>
+                <w:rFonts w:ascii="Calibri" w:cs="Calibri" w:eastAsia="Calibri" w:hAnsi="Calibri"/>
+                <w:color w:val="1F2937"/>
+                <w:sz w:val="15"/>
+                <w:szCs w:val="15"/>
+              </w:rPr>
+              <w:t xml:space="preserve">Because the scenario changed. Moving from Base to Pessimistic applies a 0.75x multiplier to operating benefits, 1.15x to capital and operating cost, and lifts the discount rate to 14.50%. Net present value moves from AED 12,083,628 to negative AED 4,940,625, a swing of AED 17.02M, of which the benefit multiplier is by far the largest single term.</w:t>
+            </w:r>
+          </w:p>
+        </w:tc>
+      </w:tr>
+      <w:tr>
+        <w:trPr>
+          <w:cantSplit/>
+          <w:tblHeader w:val="false"/>
+        </w:trPr>
+        <w:tc>
+          <w:tcPr>
+            <w:tcW w:type="dxa" w:w="2180"/>
+            <w:shd w:fill="EEF3F8" w:color="auto" w:val="clear"/>
+            <w:tcMar>
+              <w:top w:type="dxa" w:w="60"/>
+              <w:left w:type="dxa" w:w="90"/>
+              <w:bottom w:type="dxa" w:w="60"/>
+              <w:right w:type="dxa" w:w="90"/>
+            </w:tcMar>
+          </w:tcPr>
+          <w:p>
+            <w:pPr>
+              <w:spacing w:after="0" w:before="0" w:line="250"/>
+              <w:jc w:val="left"/>
+            </w:pPr>
+            <w:r>
+              <w:rPr>
+                <w:rFonts w:ascii="Calibri" w:cs="Calibri" w:eastAsia="Calibri" w:hAnsi="Calibri"/>
+                <w:color w:val="1F2937"/>
+                <w:sz w:val="15"/>
+                <w:szCs w:val="15"/>
+              </w:rPr>
+              <w:t xml:space="preserve">What happens if the discount rate rises?</w:t>
+            </w:r>
+          </w:p>
+        </w:tc>
+        <w:tc>
+          <w:tcPr>
+            <w:tcW w:type="dxa" w:w="7180"/>
+            <w:shd w:fill="EEF3F8" w:color="auto" w:val="clear"/>
+            <w:tcMar>
+              <w:top w:type="dxa" w:w="60"/>
+              <w:left w:type="dxa" w:w="90"/>
+              <w:bottom w:type="dxa" w:w="60"/>
+              <w:right w:type="dxa" w:w="90"/>
+            </w:tcMar>
+          </w:tcPr>
+          <w:p>
+            <w:pPr>
+              <w:spacing w:after="0" w:before="0" w:line="250"/>
+              <w:jc w:val="left"/>
+            </w:pPr>
+            <w:r>
+              <w:rPr>
+                <w:rFonts w:ascii="Calibri" w:cs="Calibri" w:eastAsia="Calibri" w:hAnsi="Calibri"/>
+                <w:color w:val="1F2937"/>
+                <w:sz w:val="15"/>
+                <w:szCs w:val="15"/>
+              </w:rPr>
+              <w:t xml:space="preserve">Value falls, and the break point is the internal rate of return. Net present value reaches exactly zero at 26.30%. Below that rate the project creates value; above it the project destroys value. The base case therefore carries 14.80 percentage points of headroom on the cost of capital.</w:t>
+            </w:r>
+          </w:p>
+        </w:tc>
+      </w:tr>
+      <w:tr>
+        <w:trPr>
+          <w:cantSplit/>
+          <w:tblHeader w:val="false"/>
+        </w:trPr>
+        <w:tc>
+          <w:tcPr>
+            <w:tcW w:type="dxa" w:w="2180"/>
+            <w:tcMar>
+              <w:top w:type="dxa" w:w="60"/>
+              <w:left w:type="dxa" w:w="90"/>
+              <w:bottom w:type="dxa" w:w="60"/>
+              <w:right w:type="dxa" w:w="90"/>
+            </w:tcMar>
+          </w:tcPr>
+          <w:p>
+            <w:pPr>
+              <w:spacing w:after="0" w:before="0" w:line="250"/>
+              <w:jc w:val="left"/>
+            </w:pPr>
+            <w:r>
+              <w:rPr>
+                <w:rFonts w:ascii="Calibri" w:cs="Calibri" w:eastAsia="Calibri" w:hAnsi="Calibri"/>
+                <w:color w:val="1F2937"/>
+                <w:sz w:val="15"/>
+                <w:szCs w:val="15"/>
+              </w:rPr>
+              <w:t xml:space="preserve">Which assumption has the greatest effect on the result?</w:t>
+            </w:r>
+          </w:p>
+        </w:tc>
+        <w:tc>
+          <w:tcPr>
+            <w:tcW w:type="dxa" w:w="7180"/>
+            <w:tcMar>
+              <w:top w:type="dxa" w:w="60"/>
+              <w:left w:type="dxa" w:w="90"/>
+              <w:bottom w:type="dxa" w:w="60"/>
+              <w:right w:type="dxa" w:w="90"/>
+            </w:tcMar>
+          </w:tcPr>
+          <w:p>
+            <w:pPr>
+              <w:spacing w:after="0" w:before="0" w:line="250"/>
+              <w:jc w:val="left"/>
+            </w:pPr>
+            <w:r>
+              <w:rPr>
+                <w:rFonts w:ascii="Calibri" w:cs="Calibri" w:eastAsia="Calibri" w:hAnsi="Calibri"/>
+                <w:color w:val="1F2937"/>
+                <w:sz w:val="15"/>
+                <w:szCs w:val="15"/>
+              </w:rPr>
+              <w:t xml:space="preserve">Total operating benefits, by a factor of two over anything else. Flexed by an identical plus or minus 20% so the comparison is fair, benefits swing net present value by AED 16.67M — more than the entire base-case value. Project life follows at AED 8.39M, capital expenditure AED 8.25M, cost of capital AED 5.17M, operating cost AED 3.57M and salvage AED 0.37M.</w:t>
+            </w:r>
+          </w:p>
+        </w:tc>
+      </w:tr>
+      <w:tr>
+        <w:trPr>
+          <w:cantSplit/>
+          <w:tblHeader w:val="false"/>
+        </w:trPr>
+        <w:tc>
+          <w:tcPr>
+            <w:tcW w:type="dxa" w:w="2180"/>
+            <w:shd w:fill="EEF3F8" w:color="auto" w:val="clear"/>
+            <w:tcMar>
+              <w:top w:type="dxa" w:w="60"/>
+              <w:left w:type="dxa" w:w="90"/>
+              <w:bottom w:type="dxa" w:w="60"/>
+              <w:right w:type="dxa" w:w="90"/>
+            </w:tcMar>
+          </w:tcPr>
+          <w:p>
+            <w:pPr>
+              <w:spacing w:after="0" w:before="0" w:line="250"/>
+              <w:jc w:val="left"/>
+            </w:pPr>
+            <w:r>
+              <w:rPr>
+                <w:rFonts w:ascii="Calibri" w:cs="Calibri" w:eastAsia="Calibri" w:hAnsi="Calibri"/>
+                <w:color w:val="1F2937"/>
+                <w:sz w:val="15"/>
+                <w:szCs w:val="15"/>
+              </w:rPr>
+              <w:t xml:space="preserve">Should management accept or reject the project?</w:t>
+            </w:r>
+          </w:p>
+        </w:tc>
+        <w:tc>
+          <w:tcPr>
+            <w:tcW w:type="dxa" w:w="7180"/>
+            <w:shd w:fill="EEF3F8" w:color="auto" w:val="clear"/>
+            <w:tcMar>
+              <w:top w:type="dxa" w:w="60"/>
+              <w:left w:type="dxa" w:w="90"/>
+              <w:bottom w:type="dxa" w:w="60"/>
+              <w:right w:type="dxa" w:w="90"/>
+            </w:tcMar>
+          </w:tcPr>
+          <w:p>
+            <w:pPr>
+              <w:spacing w:after="0" w:before="0" w:line="250"/>
+              <w:jc w:val="left"/>
+            </w:pPr>
+            <w:r>
+              <w:rPr>
+                <w:rFonts w:ascii="Calibri" w:cs="Calibri" w:eastAsia="Calibri" w:hAnsi="Calibri"/>
+                <w:color w:val="1F2937"/>
+                <w:sz w:val="15"/>
+                <w:szCs w:val="15"/>
+              </w:rPr>
+              <w:t xml:space="preserve">Accept, with gates. All five decision rules agree in the base case and expected value across probability-weighted scenarios is AED 9,560,152. Two conditions attach: release capital against measured Year-1 savings rather than against the calendar, and require a vendor performance guarantee before commitment. The engine returns Approve; the decision remains the committee's.</w:t>
+            </w:r>
+          </w:p>
+        </w:tc>
+      </w:tr>
+      <w:tr>
+        <w:trPr>
+          <w:cantSplit/>
+          <w:tblHeader w:val="false"/>
+        </w:trPr>
+        <w:tc>
+          <w:tcPr>
+            <w:tcW w:type="dxa" w:w="2180"/>
+            <w:tcMar>
+              <w:top w:type="dxa" w:w="60"/>
+              <w:left w:type="dxa" w:w="90"/>
+              <w:bottom w:type="dxa" w:w="60"/>
+              <w:right w:type="dxa" w:w="90"/>
+            </w:tcMar>
+          </w:tcPr>
+          <w:p>
+            <w:pPr>
+              <w:spacing w:after="0" w:before="0" w:line="250"/>
+              <w:jc w:val="left"/>
+            </w:pPr>
+            <w:r>
+              <w:rPr>
+                <w:rFonts w:ascii="Calibri" w:cs="Calibri" w:eastAsia="Calibri" w:hAnsi="Calibri"/>
+                <w:color w:val="1F2937"/>
+                <w:sz w:val="15"/>
+                <w:szCs w:val="15"/>
+              </w:rPr>
+              <w:t xml:space="preserve">Explain the result to a non-financial manager.</w:t>
+            </w:r>
+          </w:p>
+        </w:tc>
+        <w:tc>
+          <w:tcPr>
+            <w:tcW w:type="dxa" w:w="7180"/>
+            <w:tcMar>
+              <w:top w:type="dxa" w:w="60"/>
+              <w:left w:type="dxa" w:w="90"/>
+              <w:bottom w:type="dxa" w:w="60"/>
+              <w:right w:type="dxa" w:w="90"/>
+            </w:tcMar>
+          </w:tcPr>
+          <w:p>
+            <w:pPr>
+              <w:spacing w:after="0" w:before="0" w:line="250"/>
+              <w:jc w:val="left"/>
+            </w:pPr>
+            <w:r>
+              <w:rPr>
+                <w:rFonts w:ascii="Calibri" w:cs="Calibri" w:eastAsia="Calibri" w:hAnsi="Calibri"/>
+                <w:color w:val="1F2937"/>
+                <w:sz w:val="15"/>
+                <w:szCs w:val="15"/>
+              </w:rPr>
+              <w:t xml:space="preserve">The company spends AED 24.0M today. Over six years the savings and margin it generates are worth AED 36.1M in today's money, so the company ends up about AED 12.1M better off than if it did nothing. The money spent is recovered in a little over three years. The main thing that could go wrong is the savings arriving smaller than promised — if they come in more than 29% below forecast, the project stops being worth doing.</w:t>
+            </w:r>
+          </w:p>
+        </w:tc>
+      </w:tr>
+    </w:tbl>
+    <w:p>
+      <w:pPr>
+        <w:spacing w:after="100"/>
+      </w:pPr>
+      <w:r>
+        <w:rPr>
+          <w:rFonts w:ascii="Calibri" w:cs="Calibri" w:eastAsia="Calibri" w:hAnsi="Calibri"/>
+          <w:sz w:val="21"/>
+          <w:szCs w:val="21"/>
+        </w:rPr>
+        <w:t xml:space="preserve"/>
       </w:r>
     </w:p>
     <w:p>

</xml_diff>